<commit_message>
fix(adenda): preserve payload and recover anexos
</commit_message>
<xml_diff>
--- a/templates/addenda.docx
+++ b/templates/addenda.docx
@@ -107,16 +107,10 @@
           <w:rFonts w:ascii="Arial" w:cs="Arial" w:eastAsia="Arial" w:hAnsi="Arial"/>
           <w:b w:val="1"/>
           <w:bCs w:val="1"/>
-          <w:highlight w:val="yellow"/>
           <w:u w:val="single"/>
           <w:rtl w:val="0"/>
         </w:rPr>
         <w:t xml:space="preserve">{entidad_nombre}</w:t>
-      </w:r>
-      <w:r>
-        <w:rPr>
-          <w:rtl w:val="0"/>
-        </w:rPr>
       </w:r>
     </w:p>
     <w:p>
@@ -167,7 +161,6 @@
       <w:r>
         <w:rPr>
           <w:rFonts w:ascii="Arial" w:cs="Arial" w:eastAsia="Arial" w:hAnsi="Arial"/>
-          <w:highlight w:val="yellow"/>
           <w:rtl w:val="0"/>
         </w:rPr>
         <w:t xml:space="preserve">{ciudad}</w:t>
@@ -183,7 +176,6 @@
       <w:r>
         <w:rPr>
           <w:rFonts w:ascii="Arial" w:cs="Arial" w:eastAsia="Arial" w:hAnsi="Arial"/>
-          <w:highlight w:val="yellow"/>
           <w:rtl w:val="0"/>
         </w:rPr>
         <w:t xml:space="preserve">{provincia}</w:t>
@@ -199,7 +191,6 @@
       <w:r>
         <w:rPr>
           <w:rFonts w:ascii="Arial" w:cs="Arial" w:eastAsia="Arial" w:hAnsi="Arial"/>
-          <w:highlight w:val="yellow"/>
           <w:rtl w:val="0"/>
         </w:rPr>
         <w:t xml:space="preserve">{dia}</w:t>
@@ -215,7 +206,6 @@
       <w:r>
         <w:rPr>
           <w:rFonts w:ascii="Arial" w:cs="Arial" w:eastAsia="Arial" w:hAnsi="Arial"/>
-          <w:highlight w:val="yellow"/>
           <w:rtl w:val="0"/>
         </w:rPr>
         <w:t xml:space="preserve">{mes} </w:t>
@@ -330,7 +320,6 @@
       <w:r>
         <w:rPr>
           <w:rFonts w:ascii="Arial" w:cs="Arial" w:eastAsia="Arial" w:hAnsi="Arial"/>
-          <w:highlight w:val="yellow"/>
           <w:rtl w:val="0"/>
         </w:rPr>
         <w:t xml:space="preserve">{entidad_representante}</w:t>
@@ -346,7 +335,6 @@
       <w:r>
         <w:rPr>
           <w:rFonts w:ascii="Arial" w:cs="Arial" w:eastAsia="Arial" w:hAnsi="Arial"/>
-          <w:highlight w:val="yellow"/>
           <w:rtl w:val="0"/>
         </w:rPr>
         <w:t xml:space="preserve">{entidad_dni}</w:t>
@@ -362,7 +350,6 @@
       <w:r>
         <w:rPr>
           <w:rFonts w:ascii="Arial" w:cs="Arial" w:eastAsia="Arial" w:hAnsi="Arial"/>
-          <w:highlight w:val="yellow"/>
           <w:rtl w:val="0"/>
         </w:rPr>
         <w:t xml:space="preserve">{entidad_cargo}</w:t>
@@ -380,7 +367,6 @@
           <w:rFonts w:ascii="Arial" w:cs="Arial" w:eastAsia="Arial" w:hAnsi="Arial"/>
           <w:b w:val="1"/>
           <w:bCs w:val="1"/>
-          <w:highlight w:val="yellow"/>
           <w:rtl w:val="0"/>
         </w:rPr>
         <w:t xml:space="preserve">{entidad_tipo}</w:t>
@@ -411,28 +397,7 @@
           <w:color w:val="000000"/>
           <w:rtl w:val="0"/>
         </w:rPr>
-        <w:t xml:space="preserve">“</w:t>
-      </w:r>
-      <w:r>
-        <w:rPr>
-          <w:rFonts w:ascii="Arial" w:cs="Arial" w:eastAsia="Arial" w:hAnsi="Arial"/>
-          <w:b w:val="1"/>
-          <w:bCs w:val="1"/>
-          <w:color w:val="000000"/>
-          <w:highlight w:val="yellow"/>
-          <w:rtl w:val="0"/>
-        </w:rPr>
-        <w:t xml:space="preserve">LA INSTITUCIÓN</w:t>
-      </w:r>
-      <w:r>
-        <w:rPr>
-          <w:rFonts w:ascii="Arial" w:cs="Arial" w:eastAsia="Arial" w:hAnsi="Arial"/>
-          <w:b w:val="1"/>
-          <w:bCs w:val="1"/>
-          <w:color w:val="000000"/>
-          <w:rtl w:val="0"/>
-        </w:rPr>
-        <w:t xml:space="preserve">”</w:t>
+        <w:t xml:space="preserve">“LA INSTITUCIÓN”</w:t>
       </w:r>
       <w:r>
         <w:rPr>
@@ -463,7 +428,6 @@
       <w:r>
         <w:rPr>
           <w:rFonts w:ascii="Arial" w:cs="Arial" w:eastAsia="Arial" w:hAnsi="Arial"/>
-          <w:highlight w:val="yellow"/>
           <w:rtl w:val="0"/>
         </w:rPr>
         <w:t xml:space="preserve">{entidad_domicilio}</w:t>

</xml_diff>